<commit_message>
implement automation scenario 2
</commit_message>
<xml_diff>
--- a/SCRIPT TRIỂN KHAI KỊCH BẢN RABBITMQ.docx
+++ b/SCRIPT TRIỂN KHAI KỊCH BẢN RABBITMQ.docx
@@ -412,7 +412,7 @@
           <w:sz w:val="26"/>
           <w:szCs w:val="26"/>
         </w:rPr>
-        <w:pict w14:anchorId="71965756">
+        <w:pict w14:anchorId="1E6F59FA">
           <v:rect id="_x0000_i1032" alt="" style="width:468pt;height:.05pt;mso-width-percent:0;mso-height-percent:0;mso-width-percent:0;mso-height-percent:0" o:hralign="center" o:hrstd="t" o:hr="t" fillcolor="#a0a0a0" stroked="f"/>
         </w:pict>
       </w:r>
@@ -1359,7 +1359,7 @@
           <w:sz w:val="26"/>
           <w:szCs w:val="26"/>
         </w:rPr>
-        <w:pict w14:anchorId="6A4A9622">
+        <w:pict w14:anchorId="71A3F7E8">
           <v:rect id="_x0000_i1031" alt="" style="width:468pt;height:.05pt;mso-width-percent:0;mso-height-percent:0;mso-width-percent:0;mso-height-percent:0" o:hralign="center" o:hrstd="t" o:hr="t" fillcolor="#a0a0a0" stroked="f"/>
         </w:pict>
       </w:r>
@@ -1979,7 +1979,7 @@
           <w:sz w:val="26"/>
           <w:szCs w:val="26"/>
         </w:rPr>
-        <w:pict w14:anchorId="4E6FA392">
+        <w:pict w14:anchorId="770A7411">
           <v:rect id="_x0000_i1030" alt="" style="width:468pt;height:.05pt;mso-width-percent:0;mso-height-percent:0;mso-width-percent:0;mso-height-percent:0" o:hralign="center" o:hrstd="t" o:hr="t" fillcolor="#a0a0a0" stroked="f"/>
         </w:pict>
       </w:r>
@@ -2421,7 +2421,7 @@
           <w:sz w:val="26"/>
           <w:szCs w:val="26"/>
         </w:rPr>
-        <w:pict w14:anchorId="2CF0122B">
+        <w:pict w14:anchorId="04327E92">
           <v:rect id="_x0000_i1029" alt="" style="width:468pt;height:.05pt;mso-width-percent:0;mso-height-percent:0;mso-width-percent:0;mso-height-percent:0" o:hralign="center" o:hrstd="t" o:hr="t" fillcolor="#a0a0a0" stroked="f"/>
         </w:pict>
       </w:r>
@@ -2861,7 +2861,7 @@
           <w:sz w:val="26"/>
           <w:szCs w:val="26"/>
         </w:rPr>
-        <w:pict w14:anchorId="1DB00098">
+        <w:pict w14:anchorId="3C0B7E49">
           <v:rect id="_x0000_i1028" alt="" style="width:468pt;height:.05pt;mso-width-percent:0;mso-height-percent:0;mso-width-percent:0;mso-height-percent:0" o:hralign="center" o:hrstd="t" o:hr="t" fillcolor="#a0a0a0" stroked="f"/>
         </w:pict>
       </w:r>
@@ -3931,7 +3931,7 @@
           <w:sz w:val="26"/>
           <w:szCs w:val="26"/>
         </w:rPr>
-        <w:pict w14:anchorId="190253B5">
+        <w:pict w14:anchorId="63B7297A">
           <v:rect id="_x0000_i1027" alt="" style="width:468pt;height:.05pt;mso-width-percent:0;mso-height-percent:0;mso-width-percent:0;mso-height-percent:0" o:hralign="center" o:hrstd="t" o:hr="t" fillcolor="#a0a0a0" stroked="f"/>
         </w:pict>
       </w:r>
@@ -4132,7 +4132,7 @@
           <w:sz w:val="26"/>
           <w:szCs w:val="26"/>
         </w:rPr>
-        <w:pict w14:anchorId="6438A485">
+        <w:pict w14:anchorId="1B60FBED">
           <v:rect id="_x0000_i1026" alt="" style="width:468pt;height:.05pt;mso-width-percent:0;mso-height-percent:0;mso-width-percent:0;mso-height-percent:0" o:hralign="center" o:hrstd="t" o:hr="t" fillcolor="#a0a0a0" stroked="f"/>
         </w:pict>
       </w:r>
@@ -5189,7 +5189,7 @@
           <w:sz w:val="26"/>
           <w:szCs w:val="26"/>
         </w:rPr>
-        <w:pict w14:anchorId="3A50E989">
+        <w:pict w14:anchorId="428A6ABC">
           <v:rect id="_x0000_i1025" alt="" style="width:468pt;height:.05pt;mso-width-percent:0;mso-height-percent:0;mso-width-percent:0;mso-height-percent:0" o:hralign="center" o:hrstd="t" o:hr="t" fillcolor="#a0a0a0" stroked="f"/>
         </w:pict>
       </w:r>

</xml_diff>